<commit_message>
Se aplicó Arquitectura Modular de Base de Datos Basada en Migraciones a los archivos de sql
</commit_message>
<xml_diff>
--- a/Documentacion/INCLUYE CONFIGURACION PARA EL PLAN DE PRUEBAS Guía de instalación paso a paso - Grupo F.docx
+++ b/Documentacion/INCLUYE CONFIGURACION PARA EL PLAN DE PRUEBAS Guía de instalación paso a paso - Grupo F.docx
@@ -1,6 +1,6 @@
 
 <file path=word/document.xml><?xml version="1.0" encoding="utf-8"?>
-<w:document xmlns:wpc="http://schemas.microsoft.com/office/word/2010/wordprocessingCanvas" xmlns:cx="http://schemas.microsoft.com/office/drawing/2014/chartex" xmlns:mc="http://schemas.openxmlformats.org/markup-compatibility/2006" xmlns:o="urn:schemas-microsoft-com:office:office" xmlns:r="http://schemas.openxmlformats.org/officeDocument/2006/relationships" xmlns:m="http://schemas.openxmlformats.org/officeDocument/2006/math" xmlns:v="urn:schemas-microsoft-com:vml" xmlns:wp14="http://schemas.microsoft.com/office/word/2010/wordprocessingDrawing" xmlns:wp="http://schemas.openxmlformats.org/drawingml/2006/wordprocessingDrawing" xmlns:w10="urn:schemas-microsoft-com:office:word" xmlns:w="http://schemas.openxmlformats.org/wordprocessingml/2006/main" xmlns:w14="http://schemas.microsoft.com/office/word/2010/wordml" xmlns:w15="http://schemas.microsoft.com/office/word/2012/wordml" xmlns:w16se="http://schemas.microsoft.com/office/word/2015/wordml/symex" xmlns:wpg="http://schemas.microsoft.com/office/word/2010/wordprocessingGroup" xmlns:wpi="http://schemas.microsoft.com/office/word/2010/wordprocessingInk" xmlns:wne="http://schemas.microsoft.com/office/word/2006/wordml" xmlns:wps="http://schemas.microsoft.com/office/word/2010/wordprocessingShape" mc:Ignorable="w14 w15 w16se wp14">
+<w:document xmlns:wpc="http://schemas.microsoft.com/office/word/2010/wordprocessingCanvas" xmlns:cx="http://schemas.microsoft.com/office/drawing/2014/chartex" xmlns:cx1="http://schemas.microsoft.com/office/drawing/2015/9/8/chartex" xmlns:cx2="http://schemas.microsoft.com/office/drawing/2015/10/21/chartex" xmlns:cx3="http://schemas.microsoft.com/office/drawing/2016/5/9/chartex" xmlns:cx4="http://schemas.microsoft.com/office/drawing/2016/5/10/chartex" xmlns:cx5="http://schemas.microsoft.com/office/drawing/2016/5/11/chartex" xmlns:cx6="http://schemas.microsoft.com/office/drawing/2016/5/12/chartex" xmlns:cx7="http://schemas.microsoft.com/office/drawing/2016/5/13/chartex" xmlns:cx8="http://schemas.microsoft.com/office/drawing/2016/5/14/chartex" xmlns:mc="http://schemas.openxmlformats.org/markup-compatibility/2006" xmlns:aink="http://schemas.microsoft.com/office/drawing/2016/ink" xmlns:am3d="http://schemas.microsoft.com/office/drawing/2017/model3d" xmlns:o="urn:schemas-microsoft-com:office:office" xmlns:r="http://schemas.openxmlformats.org/officeDocument/2006/relationships" xmlns:m="http://schemas.openxmlformats.org/officeDocument/2006/math" xmlns:v="urn:schemas-microsoft-com:vml" xmlns:wp14="http://schemas.microsoft.com/office/word/2010/wordprocessingDrawing" xmlns:wp="http://schemas.openxmlformats.org/drawingml/2006/wordprocessingDrawing" xmlns:w10="urn:schemas-microsoft-com:office:word" xmlns:w="http://schemas.openxmlformats.org/wordprocessingml/2006/main" xmlns:w14="http://schemas.microsoft.com/office/word/2010/wordml" xmlns:w15="http://schemas.microsoft.com/office/word/2012/wordml" xmlns:w16cex="http://schemas.microsoft.com/office/word/2018/wordml/cex" xmlns:w16cid="http://schemas.microsoft.com/office/word/2016/wordml/cid" xmlns:w16="http://schemas.microsoft.com/office/word/2018/wordml" xmlns:w16sdtdh="http://schemas.microsoft.com/office/word/2020/wordml/sdtdatahash" xmlns:w16se="http://schemas.microsoft.com/office/word/2015/wordml/symex" xmlns:wpg="http://schemas.microsoft.com/office/word/2010/wordprocessingGroup" xmlns:wpi="http://schemas.microsoft.com/office/word/2010/wordprocessingInk" xmlns:wne="http://schemas.microsoft.com/office/word/2006/wordml" xmlns:wps="http://schemas.microsoft.com/office/word/2010/wordprocessingShape" mc:Ignorable="w14 w15 w16se w16cid w16 w16cex w16sdtdh wp14">
   <w:body>
     <w:p>
       <w:pPr>
@@ -298,7 +298,6 @@
           <w:lang w:eastAsia="es-ES"/>
         </w:rPr>
       </w:pPr>
-      <w:proofErr w:type="spellStart"/>
       <w:r>
         <w:rPr>
           <w:rFonts w:ascii="Times New Roman" w:eastAsia="Times New Roman" w:hAnsi="Times New Roman" w:cs="Times New Roman"/>
@@ -310,7 +309,6 @@
         </w:rPr>
         <w:t>npm</w:t>
       </w:r>
-      <w:proofErr w:type="spellEnd"/>
       <w:r>
         <w:rPr>
           <w:rFonts w:ascii="Times New Roman" w:eastAsia="Times New Roman" w:hAnsi="Times New Roman" w:cs="Times New Roman"/>
@@ -355,21 +353,8 @@
           <w:szCs w:val="24"/>
           <w:lang w:eastAsia="es-ES"/>
         </w:rPr>
-        <w:t xml:space="preserve">Visual Studio </w:t>
-      </w:r>
-      <w:proofErr w:type="spellStart"/>
-      <w:r>
-        <w:rPr>
-          <w:rFonts w:ascii="Times New Roman" w:eastAsia="Times New Roman" w:hAnsi="Times New Roman" w:cs="Times New Roman"/>
-          <w:b/>
-          <w:bCs/>
-          <w:sz w:val="24"/>
-          <w:szCs w:val="24"/>
-          <w:lang w:eastAsia="es-ES"/>
-        </w:rPr>
-        <w:t>Code</w:t>
-      </w:r>
-      <w:proofErr w:type="spellEnd"/>
+        <w:t>Visual Studio Code</w:t>
+      </w:r>
       <w:r>
         <w:rPr>
           <w:rFonts w:ascii="Times New Roman" w:eastAsia="Times New Roman" w:hAnsi="Times New Roman" w:cs="Times New Roman"/>
@@ -597,49 +582,15 @@
           <w:lang w:eastAsia="es-ES"/>
         </w:rPr>
       </w:pPr>
-      <w:proofErr w:type="spellStart"/>
-      <w:r>
-        <w:rPr>
-          <w:rFonts w:ascii="Times New Roman" w:eastAsia="Times New Roman" w:hAnsi="Times New Roman" w:cs="Times New Roman"/>
-          <w:b/>
-          <w:sz w:val="24"/>
-          <w:szCs w:val="24"/>
-          <w:lang w:eastAsia="es-ES"/>
-        </w:rPr>
-        <w:t>MariaDB</w:t>
-      </w:r>
-      <w:proofErr w:type="spellEnd"/>
-      <w:r>
-        <w:rPr>
-          <w:rFonts w:ascii="Times New Roman" w:eastAsia="Times New Roman" w:hAnsi="Times New Roman" w:cs="Times New Roman"/>
-          <w:b/>
-          <w:sz w:val="24"/>
-          <w:szCs w:val="24"/>
-          <w:lang w:eastAsia="es-ES"/>
-        </w:rPr>
-        <w:t xml:space="preserve"> (equivalente a </w:t>
-      </w:r>
-      <w:proofErr w:type="spellStart"/>
-      <w:r>
-        <w:rPr>
-          <w:rFonts w:ascii="Times New Roman" w:eastAsia="Times New Roman" w:hAnsi="Times New Roman" w:cs="Times New Roman"/>
-          <w:b/>
-          <w:sz w:val="24"/>
-          <w:szCs w:val="24"/>
-          <w:lang w:eastAsia="es-ES"/>
-        </w:rPr>
-        <w:t>MySQL</w:t>
-      </w:r>
-      <w:proofErr w:type="spellEnd"/>
-      <w:r>
-        <w:rPr>
-          <w:rFonts w:ascii="Times New Roman" w:eastAsia="Times New Roman" w:hAnsi="Times New Roman" w:cs="Times New Roman"/>
-          <w:b/>
-          <w:sz w:val="24"/>
-          <w:szCs w:val="24"/>
-          <w:lang w:eastAsia="es-ES"/>
-        </w:rPr>
-        <w:t>)</w:t>
+      <w:r>
+        <w:rPr>
+          <w:rFonts w:ascii="Times New Roman" w:eastAsia="Times New Roman" w:hAnsi="Times New Roman" w:cs="Times New Roman"/>
+          <w:b/>
+          <w:sz w:val="24"/>
+          <w:szCs w:val="24"/>
+          <w:lang w:eastAsia="es-ES"/>
+        </w:rPr>
+        <w:t>MariaDB (equivalente a MySQL)</w:t>
       </w:r>
       <w:r>
         <w:rPr>
@@ -748,7 +699,6 @@
           <w:lang w:eastAsia="es-ES"/>
         </w:rPr>
       </w:pPr>
-      <w:proofErr w:type="spellStart"/>
       <w:r>
         <w:rPr>
           <w:rFonts w:ascii="Times New Roman" w:eastAsia="Times New Roman" w:hAnsi="Times New Roman" w:cs="Times New Roman"/>
@@ -759,7 +709,6 @@
         </w:rPr>
         <w:t>phpMyAdmin</w:t>
       </w:r>
-      <w:proofErr w:type="spellEnd"/>
       <w:r>
         <w:rPr>
           <w:rFonts w:ascii="Times New Roman" w:eastAsia="Times New Roman" w:hAnsi="Times New Roman" w:cs="Times New Roman"/>
@@ -849,27 +798,7 @@
           <w:lang w:eastAsia="es-ES"/>
         </w:rPr>
         <w:br/>
-        <w:t xml:space="preserve">XAMPP simplifica la configuración del entorno </w:t>
-      </w:r>
-      <w:proofErr w:type="spellStart"/>
-      <w:r>
-        <w:rPr>
-          <w:rFonts w:ascii="Times New Roman" w:eastAsia="Times New Roman" w:hAnsi="Times New Roman" w:cs="Times New Roman"/>
-          <w:sz w:val="24"/>
-          <w:szCs w:val="24"/>
-          <w:lang w:eastAsia="es-ES"/>
-        </w:rPr>
-        <w:t>backend</w:t>
-      </w:r>
-      <w:proofErr w:type="spellEnd"/>
-      <w:r>
-        <w:rPr>
-          <w:rFonts w:ascii="Times New Roman" w:eastAsia="Times New Roman" w:hAnsi="Times New Roman" w:cs="Times New Roman"/>
-          <w:sz w:val="24"/>
-          <w:szCs w:val="24"/>
-          <w:lang w:eastAsia="es-ES"/>
-        </w:rPr>
-        <w:t>, ya que instala y configura automáticamente:</w:t>
+        <w:t>XAMPP simplifica la configuración del entorno backend, ya que instala y configura automáticamente:</w:t>
       </w:r>
     </w:p>
     <w:p>
@@ -950,43 +879,17 @@
         </w:rPr>
         <w:t>Un motor de base de datos (</w:t>
       </w:r>
-      <w:proofErr w:type="spellStart"/>
-      <w:r>
-        <w:rPr>
-          <w:rFonts w:ascii="Times New Roman" w:eastAsia="Times New Roman" w:hAnsi="Times New Roman" w:cs="Times New Roman"/>
-          <w:b/>
-          <w:bCs/>
-          <w:sz w:val="24"/>
-          <w:szCs w:val="24"/>
-          <w:lang w:eastAsia="es-ES"/>
-        </w:rPr>
-        <w:t>MariaDB</w:t>
-      </w:r>
-      <w:proofErr w:type="spellEnd"/>
-      <w:r>
-        <w:rPr>
-          <w:rFonts w:ascii="Times New Roman" w:eastAsia="Times New Roman" w:hAnsi="Times New Roman" w:cs="Times New Roman"/>
-          <w:b/>
-          <w:bCs/>
-          <w:sz w:val="24"/>
-          <w:szCs w:val="24"/>
-          <w:lang w:eastAsia="es-ES"/>
-        </w:rPr>
-        <w:t>/</w:t>
-      </w:r>
-      <w:proofErr w:type="spellStart"/>
-      <w:r>
-        <w:rPr>
-          <w:rFonts w:ascii="Times New Roman" w:eastAsia="Times New Roman" w:hAnsi="Times New Roman" w:cs="Times New Roman"/>
-          <w:b/>
-          <w:bCs/>
-          <w:sz w:val="24"/>
-          <w:szCs w:val="24"/>
-          <w:lang w:eastAsia="es-ES"/>
-        </w:rPr>
-        <w:t>MySQL</w:t>
-      </w:r>
-      <w:proofErr w:type="spellEnd"/>
+      <w:r>
+        <w:rPr>
+          <w:rFonts w:ascii="Times New Roman" w:eastAsia="Times New Roman" w:hAnsi="Times New Roman" w:cs="Times New Roman"/>
+          <w:b/>
+          <w:bCs/>
+          <w:sz w:val="24"/>
+          <w:szCs w:val="24"/>
+          <w:lang w:eastAsia="es-ES"/>
+        </w:rPr>
+        <w:t>MariaDB/MySQL</w:t>
+      </w:r>
       <w:r>
         <w:rPr>
           <w:rFonts w:ascii="Times New Roman" w:eastAsia="Times New Roman" w:hAnsi="Times New Roman" w:cs="Times New Roman"/>
@@ -1084,7 +987,6 @@
         </w:rPr>
         <w:t>Una interfaz gráfica para administrar la base de datos (</w:t>
       </w:r>
-      <w:proofErr w:type="spellStart"/>
       <w:r>
         <w:rPr>
           <w:rFonts w:ascii="Times New Roman" w:eastAsia="Times New Roman" w:hAnsi="Times New Roman" w:cs="Times New Roman"/>
@@ -1096,7 +998,6 @@
         </w:rPr>
         <w:t>phpMyAdmin</w:t>
       </w:r>
-      <w:proofErr w:type="spellEnd"/>
       <w:r>
         <w:rPr>
           <w:rFonts w:ascii="Times New Roman" w:eastAsia="Times New Roman" w:hAnsi="Times New Roman" w:cs="Times New Roman"/>
@@ -1133,7 +1034,7 @@
           <w:szCs w:val="24"/>
           <w:lang w:eastAsia="es-ES"/>
         </w:rPr>
-        <w:pict>
+        <w:pict w14:anchorId="3F42958C">
           <v:rect id="_x0000_i1025" style="width:0;height:1.5pt" o:hralign="center" o:hrstd="t" o:hr="t" fillcolor="#a0a0a0" stroked="f"/>
         </w:pict>
       </w:r>
@@ -1289,7 +1190,6 @@
         </w:rPr>
         <w:t xml:space="preserve"> el repositorio del proyecto desde GitHub dentro de la carpeta </w:t>
       </w:r>
-      <w:proofErr w:type="spellStart"/>
       <w:r>
         <w:rPr>
           <w:rFonts w:ascii="Courier New" w:eastAsia="Times New Roman" w:hAnsi="Courier New" w:cs="Courier New"/>
@@ -1301,7 +1201,6 @@
         </w:rPr>
         <w:t>htdocs</w:t>
       </w:r>
-      <w:proofErr w:type="spellEnd"/>
       <w:r>
         <w:rPr>
           <w:rFonts w:ascii="Times New Roman" w:eastAsia="Times New Roman" w:hAnsi="Times New Roman" w:cs="Times New Roman"/>
@@ -1363,73 +1262,7 @@
           <w:szCs w:val="24"/>
           <w:lang w:eastAsia="es-ES"/>
         </w:rPr>
-        <w:t xml:space="preserve">Abra su terminal (CMD, </w:t>
-      </w:r>
-      <w:proofErr w:type="spellStart"/>
-      <w:r>
-        <w:rPr>
-          <w:rFonts w:ascii="Times New Roman" w:hAnsi="Times New Roman" w:cs="Times New Roman"/>
-          <w:color w:val="000000" w:themeColor="text1"/>
-          <w:sz w:val="24"/>
-          <w:szCs w:val="24"/>
-          <w:lang w:eastAsia="es-ES"/>
-        </w:rPr>
-        <w:t>PowerShell</w:t>
-      </w:r>
-      <w:proofErr w:type="spellEnd"/>
-      <w:r>
-        <w:rPr>
-          <w:rFonts w:ascii="Times New Roman" w:hAnsi="Times New Roman" w:cs="Times New Roman"/>
-          <w:color w:val="000000" w:themeColor="text1"/>
-          <w:sz w:val="24"/>
-          <w:szCs w:val="24"/>
-          <w:lang w:eastAsia="es-ES"/>
-        </w:rPr>
-        <w:t xml:space="preserve"> o </w:t>
-      </w:r>
-      <w:proofErr w:type="spellStart"/>
-      <w:r>
-        <w:rPr>
-          <w:rFonts w:ascii="Times New Roman" w:hAnsi="Times New Roman" w:cs="Times New Roman"/>
-          <w:color w:val="000000" w:themeColor="text1"/>
-          <w:sz w:val="24"/>
-          <w:szCs w:val="24"/>
-          <w:lang w:eastAsia="es-ES"/>
-        </w:rPr>
-        <w:t>Git</w:t>
-      </w:r>
-      <w:proofErr w:type="spellEnd"/>
-      <w:r>
-        <w:rPr>
-          <w:rFonts w:ascii="Times New Roman" w:hAnsi="Times New Roman" w:cs="Times New Roman"/>
-          <w:color w:val="000000" w:themeColor="text1"/>
-          <w:sz w:val="24"/>
-          <w:szCs w:val="24"/>
-          <w:lang w:eastAsia="es-ES"/>
-        </w:rPr>
-        <w:t xml:space="preserve"> </w:t>
-      </w:r>
-      <w:proofErr w:type="spellStart"/>
-      <w:r>
-        <w:rPr>
-          <w:rFonts w:ascii="Times New Roman" w:hAnsi="Times New Roman" w:cs="Times New Roman"/>
-          <w:color w:val="000000" w:themeColor="text1"/>
-          <w:sz w:val="24"/>
-          <w:szCs w:val="24"/>
-          <w:lang w:eastAsia="es-ES"/>
-        </w:rPr>
-        <w:t>Bash</w:t>
-      </w:r>
-      <w:proofErr w:type="spellEnd"/>
-      <w:r>
-        <w:rPr>
-          <w:rFonts w:ascii="Times New Roman" w:hAnsi="Times New Roman" w:cs="Times New Roman"/>
-          <w:color w:val="000000" w:themeColor="text1"/>
-          <w:sz w:val="24"/>
-          <w:szCs w:val="24"/>
-          <w:lang w:eastAsia="es-ES"/>
-        </w:rPr>
-        <w:t>).</w:t>
+        <w:t>Abra su terminal (CMD, PowerShell o Git Bash).</w:t>
       </w:r>
     </w:p>
     <w:p>
@@ -1465,20 +1298,8 @@
           <w:szCs w:val="24"/>
           <w:lang w:eastAsia="es-ES"/>
         </w:rPr>
-        <w:t xml:space="preserve">de </w:t>
-      </w:r>
-      <w:proofErr w:type="spellStart"/>
-      <w:r>
-        <w:rPr>
-          <w:rFonts w:ascii="Times New Roman" w:hAnsi="Times New Roman" w:cs="Times New Roman"/>
-          <w:color w:val="000000" w:themeColor="text1"/>
-          <w:sz w:val="24"/>
-          <w:szCs w:val="24"/>
-          <w:lang w:eastAsia="es-ES"/>
-        </w:rPr>
-        <w:t>htdocs</w:t>
-      </w:r>
-      <w:proofErr w:type="spellEnd"/>
+        <w:t>de htdocs</w:t>
+      </w:r>
       <w:r>
         <w:rPr>
           <w:rFonts w:ascii="Times New Roman" w:hAnsi="Times New Roman" w:cs="Times New Roman"/>
@@ -1572,23 +1393,13 @@
         </w:rPr>
         <w:tab/>
       </w:r>
-      <w:proofErr w:type="spellStart"/>
       <w:r>
         <w:rPr>
           <w:rFonts w:ascii="Courier New" w:hAnsi="Courier New" w:cs="Courier New"/>
           <w:sz w:val="20"/>
           <w:lang w:val="en-US" w:eastAsia="es-ES"/>
         </w:rPr>
-        <w:t>git</w:t>
-      </w:r>
-      <w:proofErr w:type="spellEnd"/>
-      <w:r>
-        <w:rPr>
-          <w:rFonts w:ascii="Courier New" w:hAnsi="Courier New" w:cs="Courier New"/>
-          <w:sz w:val="20"/>
-          <w:lang w:val="en-US" w:eastAsia="es-ES"/>
-        </w:rPr>
-        <w:t xml:space="preserve"> clone </w:t>
+        <w:t xml:space="preserve">git clone </w:t>
       </w:r>
       <w:r>
         <w:rPr>
@@ -1811,7 +1622,7 @@
           <w:szCs w:val="24"/>
           <w:lang w:eastAsia="es-ES"/>
         </w:rPr>
-        <w:pict>
+        <w:pict w14:anchorId="786FF0E6">
           <v:rect id="_x0000_i1026" style="width:0;height:1.5pt" o:hralign="center" o:hrstd="t" o:hr="t" fillcolor="#a0a0a0" stroked="f"/>
         </w:pict>
       </w:r>
@@ -2015,7 +1826,6 @@
         </w:rPr>
         <w:t xml:space="preserve">Cargar y ejecutar el script </w:t>
       </w:r>
-      <w:proofErr w:type="spellStart"/>
       <w:r>
         <w:rPr>
           <w:rFonts w:ascii="Courier New" w:eastAsia="Times New Roman" w:hAnsi="Courier New" w:cs="Courier New"/>
@@ -2025,7 +1835,6 @@
         </w:rPr>
         <w:t>recrea_sys.sql</w:t>
       </w:r>
-      <w:proofErr w:type="spellEnd"/>
       <w:r>
         <w:rPr>
           <w:rFonts w:ascii="Times New Roman" w:eastAsia="Times New Roman" w:hAnsi="Times New Roman" w:cs="Times New Roman"/>
@@ -2044,7 +1853,6 @@
         </w:rPr>
         <w:t xml:space="preserve">(que está junto a las carpetas </w:t>
       </w:r>
-      <w:proofErr w:type="spellStart"/>
       <w:r>
         <w:rPr>
           <w:rFonts w:ascii="Courier New" w:eastAsia="Times New Roman" w:hAnsi="Courier New" w:cs="Courier New"/>
@@ -2054,9 +1862,27 @@
           <w:szCs w:val="20"/>
           <w:lang w:eastAsia="es-ES"/>
         </w:rPr>
-        <w:t>backend</w:t>
-      </w:r>
-      <w:proofErr w:type="spellEnd"/>
+        <w:t xml:space="preserve">backend </w:t>
+      </w:r>
+      <w:r>
+        <w:rPr>
+          <w:rFonts w:ascii="Times New Roman" w:eastAsia="Times New Roman" w:hAnsi="Times New Roman" w:cs="Times New Roman"/>
+          <w:bCs/>
+          <w:sz w:val="24"/>
+          <w:szCs w:val="24"/>
+          <w:lang w:eastAsia="es-ES"/>
+        </w:rPr>
+        <w:t>y</w:t>
+      </w:r>
+      <w:r>
+        <w:rPr>
+          <w:rFonts w:ascii="Times New Roman" w:eastAsia="Times New Roman" w:hAnsi="Times New Roman" w:cs="Times New Roman"/>
+          <w:sz w:val="24"/>
+          <w:szCs w:val="24"/>
+          <w:lang w:eastAsia="es-ES"/>
+        </w:rPr>
+        <w:t xml:space="preserve"> </w:t>
+      </w:r>
       <w:r>
         <w:rPr>
           <w:rFonts w:ascii="Courier New" w:eastAsia="Times New Roman" w:hAnsi="Courier New" w:cs="Courier New"/>
@@ -2066,11 +1892,180 @@
           <w:szCs w:val="20"/>
           <w:lang w:eastAsia="es-ES"/>
         </w:rPr>
+        <w:t>frontend</w:t>
+      </w:r>
+      <w:r>
+        <w:rPr>
+          <w:rFonts w:ascii="Times New Roman" w:eastAsia="Times New Roman" w:hAnsi="Times New Roman" w:cs="Times New Roman"/>
+          <w:sz w:val="24"/>
+          <w:szCs w:val="24"/>
+          <w:lang w:eastAsia="es-ES"/>
+        </w:rPr>
+        <w:t xml:space="preserve">) </w:t>
+      </w:r>
+      <w:r>
+        <w:rPr>
+          <w:rFonts w:ascii="Times New Roman" w:eastAsia="Times New Roman" w:hAnsi="Times New Roman" w:cs="Times New Roman"/>
+          <w:sz w:val="24"/>
+          <w:szCs w:val="24"/>
+          <w:lang w:eastAsia="es-ES"/>
+        </w:rPr>
+        <w:t>para importar la base de datos con sus</w:t>
+      </w:r>
+      <w:r>
+        <w:rPr>
+          <w:rFonts w:ascii="Times New Roman" w:eastAsia="Times New Roman" w:hAnsi="Times New Roman" w:cs="Times New Roman"/>
+          <w:sz w:val="24"/>
+          <w:szCs w:val="24"/>
+          <w:lang w:eastAsia="es-ES"/>
+        </w:rPr>
+        <w:t xml:space="preserve"> tablas, relaciones e índices.</w:t>
+      </w:r>
+    </w:p>
+    <w:p>
+      <w:pPr>
+        <w:spacing w:after="0" w:line="240" w:lineRule="auto"/>
+        <w:rPr>
+          <w:rFonts w:ascii="Times New Roman" w:eastAsia="Times New Roman" w:hAnsi="Times New Roman" w:cs="Times New Roman"/>
+          <w:sz w:val="24"/>
+          <w:szCs w:val="24"/>
+          <w:lang w:eastAsia="es-ES"/>
+        </w:rPr>
+      </w:pPr>
+      <w:r>
+        <w:rPr>
+          <w:rFonts w:ascii="Times New Roman" w:eastAsia="Times New Roman" w:hAnsi="Times New Roman" w:cs="Times New Roman"/>
+          <w:sz w:val="24"/>
+          <w:szCs w:val="24"/>
+          <w:lang w:eastAsia="es-ES"/>
+        </w:rPr>
+        <w:pict w14:anchorId="7979ADF9">
+          <v:rect id="_x0000_i1027" style="width:0;height:1.5pt" o:hralign="center" o:hrstd="t" o:hr="t" fillcolor="#a0a0a0" stroked="f"/>
+        </w:pict>
+      </w:r>
+    </w:p>
+    <w:p>
+      <w:pPr>
+        <w:spacing w:before="100" w:beforeAutospacing="1" w:after="100" w:afterAutospacing="1" w:line="240" w:lineRule="auto"/>
+        <w:outlineLvl w:val="2"/>
+        <w:rPr>
+          <w:rFonts w:ascii="Times New Roman" w:eastAsia="Times New Roman" w:hAnsi="Times New Roman" w:cs="Times New Roman"/>
+          <w:b/>
+          <w:bCs/>
+          <w:sz w:val="32"/>
+          <w:szCs w:val="27"/>
+          <w:lang w:eastAsia="es-ES"/>
+        </w:rPr>
+      </w:pPr>
+      <w:r>
+        <w:rPr>
+          <w:rFonts w:ascii="Times New Roman" w:eastAsia="Times New Roman" w:hAnsi="Times New Roman" w:cs="Times New Roman"/>
+          <w:b/>
+          <w:bCs/>
+          <w:sz w:val="32"/>
+          <w:szCs w:val="27"/>
+          <w:lang w:eastAsia="es-ES"/>
+        </w:rPr>
+        <w:t>Preparar el frontend</w:t>
+      </w:r>
+    </w:p>
+    <w:p>
+      <w:pPr>
+        <w:spacing w:before="100" w:beforeAutospacing="1" w:after="100" w:afterAutospacing="1" w:line="240" w:lineRule="auto"/>
+        <w:outlineLvl w:val="3"/>
+        <w:rPr>
+          <w:rFonts w:ascii="Times New Roman" w:eastAsia="Times New Roman" w:hAnsi="Times New Roman" w:cs="Times New Roman"/>
+          <w:b/>
+          <w:bCs/>
+          <w:sz w:val="24"/>
+          <w:szCs w:val="24"/>
+          <w:lang w:eastAsia="es-ES"/>
+        </w:rPr>
+      </w:pPr>
+      <w:r>
+        <w:rPr>
+          <w:rFonts w:ascii="Times New Roman" w:eastAsia="Times New Roman" w:hAnsi="Times New Roman" w:cs="Times New Roman"/>
+          <w:b/>
+          <w:bCs/>
+          <w:sz w:val="24"/>
+          <w:szCs w:val="24"/>
+          <w:lang w:eastAsia="es-ES"/>
+        </w:rPr>
+        <w:t>9. Abr</w:t>
+      </w:r>
+      <w:r>
+        <w:rPr>
+          <w:rFonts w:ascii="Times New Roman" w:eastAsia="Times New Roman" w:hAnsi="Times New Roman" w:cs="Times New Roman"/>
+          <w:b/>
+          <w:bCs/>
+          <w:sz w:val="24"/>
+          <w:szCs w:val="24"/>
+          <w:lang w:eastAsia="es-ES"/>
+        </w:rPr>
+        <w:t>a</w:t>
+      </w:r>
+      <w:r>
+        <w:rPr>
+          <w:rFonts w:ascii="Times New Roman" w:eastAsia="Times New Roman" w:hAnsi="Times New Roman" w:cs="Times New Roman"/>
+          <w:b/>
+          <w:bCs/>
+          <w:sz w:val="24"/>
+          <w:szCs w:val="24"/>
+          <w:lang w:eastAsia="es-ES"/>
+        </w:rPr>
+        <w:t xml:space="preserve"> Visual Studio Code en la carpeta clonada del proyecto.</w:t>
+      </w:r>
+    </w:p>
+    <w:p>
+      <w:pPr>
+        <w:spacing w:before="100" w:beforeAutospacing="1" w:after="100" w:afterAutospacing="1" w:line="240" w:lineRule="auto"/>
+        <w:outlineLvl w:val="3"/>
+        <w:rPr>
+          <w:rFonts w:ascii="Times New Roman" w:eastAsia="Times New Roman" w:hAnsi="Times New Roman" w:cs="Times New Roman"/>
+          <w:b/>
+          <w:bCs/>
+          <w:sz w:val="24"/>
+          <w:szCs w:val="24"/>
+          <w:lang w:eastAsia="es-ES"/>
+        </w:rPr>
+      </w:pPr>
+      <w:r>
+        <w:rPr>
+          <w:rFonts w:ascii="Times New Roman" w:eastAsia="Times New Roman" w:hAnsi="Times New Roman" w:cs="Times New Roman"/>
+          <w:b/>
+          <w:bCs/>
+          <w:sz w:val="24"/>
+          <w:szCs w:val="24"/>
+          <w:lang w:eastAsia="es-ES"/>
+        </w:rPr>
+        <w:t xml:space="preserve">10. </w:t>
+      </w:r>
+      <w:r>
+        <w:rPr>
+          <w:rFonts w:ascii="Times New Roman" w:eastAsia="Times New Roman" w:hAnsi="Times New Roman" w:cs="Times New Roman"/>
+          <w:b/>
+          <w:bCs/>
+          <w:sz w:val="24"/>
+          <w:szCs w:val="24"/>
+          <w:lang w:eastAsia="es-ES"/>
+        </w:rPr>
+        <w:t>Cierre la terminal</w:t>
+      </w:r>
+      <w:r>
+        <w:rPr>
+          <w:rFonts w:ascii="Times New Roman" w:eastAsia="Times New Roman" w:hAnsi="Times New Roman" w:cs="Times New Roman"/>
+          <w:b/>
+          <w:bCs/>
+          <w:sz w:val="24"/>
+          <w:szCs w:val="24"/>
+          <w:lang w:eastAsia="es-ES"/>
+        </w:rPr>
         <w:t xml:space="preserve"> </w:t>
       </w:r>
       <w:r>
         <w:rPr>
           <w:rFonts w:ascii="Times New Roman" w:eastAsia="Times New Roman" w:hAnsi="Times New Roman" w:cs="Times New Roman"/>
+          <w:b/>
           <w:bCs/>
           <w:sz w:val="24"/>
           <w:szCs w:val="24"/>
@@ -2081,13 +2076,58 @@
       <w:r>
         <w:rPr>
           <w:rFonts w:ascii="Times New Roman" w:eastAsia="Times New Roman" w:hAnsi="Times New Roman" w:cs="Times New Roman"/>
-          <w:sz w:val="24"/>
-          <w:szCs w:val="24"/>
-          <w:lang w:eastAsia="es-ES"/>
-        </w:rPr>
-        <w:t xml:space="preserve"> </w:t>
-      </w:r>
-      <w:proofErr w:type="spellStart"/>
+          <w:b/>
+          <w:bCs/>
+          <w:sz w:val="24"/>
+          <w:szCs w:val="24"/>
+          <w:lang w:eastAsia="es-ES"/>
+        </w:rPr>
+        <w:t xml:space="preserve"> abra</w:t>
+      </w:r>
+      <w:r>
+        <w:rPr>
+          <w:rFonts w:ascii="Times New Roman" w:eastAsia="Times New Roman" w:hAnsi="Times New Roman" w:cs="Times New Roman"/>
+          <w:b/>
+          <w:bCs/>
+          <w:sz w:val="24"/>
+          <w:szCs w:val="24"/>
+          <w:lang w:eastAsia="es-ES"/>
+        </w:rPr>
+        <w:t xml:space="preserve"> otra</w:t>
+      </w:r>
+      <w:r>
+        <w:rPr>
+          <w:rFonts w:ascii="Times New Roman" w:eastAsia="Times New Roman" w:hAnsi="Times New Roman" w:cs="Times New Roman"/>
+          <w:b/>
+          <w:bCs/>
+          <w:sz w:val="24"/>
+          <w:szCs w:val="24"/>
+          <w:lang w:eastAsia="es-ES"/>
+        </w:rPr>
+        <w:t xml:space="preserve"> en VS Cose y v</w:t>
+      </w:r>
+      <w:r>
+        <w:rPr>
+          <w:rFonts w:ascii="Times New Roman" w:eastAsia="Times New Roman" w:hAnsi="Times New Roman" w:cs="Times New Roman"/>
+          <w:b/>
+          <w:bCs/>
+          <w:sz w:val="24"/>
+          <w:szCs w:val="24"/>
+          <w:lang w:eastAsia="es-ES"/>
+        </w:rPr>
+        <w:t>aya</w:t>
+      </w:r>
+      <w:r>
+        <w:rPr>
+          <w:rFonts w:ascii="Times New Roman" w:eastAsia="Times New Roman" w:hAnsi="Times New Roman" w:cs="Times New Roman"/>
+          <w:b/>
+          <w:bCs/>
+          <w:sz w:val="24"/>
+          <w:szCs w:val="24"/>
+          <w:lang w:eastAsia="es-ES"/>
+        </w:rPr>
+        <w:t xml:space="preserve"> a la subcarpeta </w:t>
+      </w:r>
       <w:r>
         <w:rPr>
           <w:rFonts w:ascii="Courier New" w:eastAsia="Times New Roman" w:hAnsi="Courier New" w:cs="Courier New"/>
@@ -2099,291 +2139,6 @@
         </w:rPr>
         <w:t>frontend</w:t>
       </w:r>
-      <w:proofErr w:type="spellEnd"/>
-      <w:r>
-        <w:rPr>
-          <w:rFonts w:ascii="Times New Roman" w:eastAsia="Times New Roman" w:hAnsi="Times New Roman" w:cs="Times New Roman"/>
-          <w:sz w:val="24"/>
-          <w:szCs w:val="24"/>
-          <w:lang w:eastAsia="es-ES"/>
-        </w:rPr>
-        <w:t xml:space="preserve">) </w:t>
-      </w:r>
-      <w:r>
-        <w:rPr>
-          <w:rFonts w:ascii="Times New Roman" w:eastAsia="Times New Roman" w:hAnsi="Times New Roman" w:cs="Times New Roman"/>
-          <w:sz w:val="24"/>
-          <w:szCs w:val="24"/>
-          <w:lang w:eastAsia="es-ES"/>
-        </w:rPr>
-        <w:t>para importar la base de datos con sus</w:t>
-      </w:r>
-      <w:r>
-        <w:rPr>
-          <w:rFonts w:ascii="Times New Roman" w:eastAsia="Times New Roman" w:hAnsi="Times New Roman" w:cs="Times New Roman"/>
-          <w:sz w:val="24"/>
-          <w:szCs w:val="24"/>
-          <w:lang w:eastAsia="es-ES"/>
-        </w:rPr>
-        <w:t xml:space="preserve"> tablas, relaciones e índices.</w:t>
-      </w:r>
-    </w:p>
-    <w:p>
-      <w:pPr>
-        <w:spacing w:after="0" w:line="240" w:lineRule="auto"/>
-        <w:rPr>
-          <w:rFonts w:ascii="Times New Roman" w:eastAsia="Times New Roman" w:hAnsi="Times New Roman" w:cs="Times New Roman"/>
-          <w:sz w:val="24"/>
-          <w:szCs w:val="24"/>
-          <w:lang w:eastAsia="es-ES"/>
-        </w:rPr>
-      </w:pPr>
-      <w:r>
-        <w:rPr>
-          <w:rFonts w:ascii="Times New Roman" w:eastAsia="Times New Roman" w:hAnsi="Times New Roman" w:cs="Times New Roman"/>
-          <w:sz w:val="24"/>
-          <w:szCs w:val="24"/>
-          <w:lang w:eastAsia="es-ES"/>
-        </w:rPr>
-        <w:pict>
-          <v:rect id="_x0000_i1027" style="width:0;height:1.5pt" o:hralign="center" o:hrstd="t" o:hr="t" fillcolor="#a0a0a0" stroked="f"/>
-        </w:pict>
-      </w:r>
-    </w:p>
-    <w:p>
-      <w:pPr>
-        <w:spacing w:before="100" w:beforeAutospacing="1" w:after="100" w:afterAutospacing="1" w:line="240" w:lineRule="auto"/>
-        <w:outlineLvl w:val="2"/>
-        <w:rPr>
-          <w:rFonts w:ascii="Times New Roman" w:eastAsia="Times New Roman" w:hAnsi="Times New Roman" w:cs="Times New Roman"/>
-          <w:b/>
-          <w:bCs/>
-          <w:sz w:val="32"/>
-          <w:szCs w:val="27"/>
-          <w:lang w:eastAsia="es-ES"/>
-        </w:rPr>
-      </w:pPr>
-      <w:r>
-        <w:rPr>
-          <w:rFonts w:ascii="Times New Roman" w:eastAsia="Times New Roman" w:hAnsi="Times New Roman" w:cs="Times New Roman"/>
-          <w:b/>
-          <w:bCs/>
-          <w:sz w:val="32"/>
-          <w:szCs w:val="27"/>
-          <w:lang w:eastAsia="es-ES"/>
-        </w:rPr>
-        <w:t xml:space="preserve">Preparar el </w:t>
-      </w:r>
-      <w:proofErr w:type="spellStart"/>
-      <w:r>
-        <w:rPr>
-          <w:rFonts w:ascii="Times New Roman" w:eastAsia="Times New Roman" w:hAnsi="Times New Roman" w:cs="Times New Roman"/>
-          <w:b/>
-          <w:bCs/>
-          <w:sz w:val="32"/>
-          <w:szCs w:val="27"/>
-          <w:lang w:eastAsia="es-ES"/>
-        </w:rPr>
-        <w:t>frontend</w:t>
-      </w:r>
-      <w:proofErr w:type="spellEnd"/>
-    </w:p>
-    <w:p>
-      <w:pPr>
-        <w:spacing w:before="100" w:beforeAutospacing="1" w:after="100" w:afterAutospacing="1" w:line="240" w:lineRule="auto"/>
-        <w:outlineLvl w:val="3"/>
-        <w:rPr>
-          <w:rFonts w:ascii="Times New Roman" w:eastAsia="Times New Roman" w:hAnsi="Times New Roman" w:cs="Times New Roman"/>
-          <w:b/>
-          <w:bCs/>
-          <w:sz w:val="24"/>
-          <w:szCs w:val="24"/>
-          <w:lang w:eastAsia="es-ES"/>
-        </w:rPr>
-      </w:pPr>
-      <w:r>
-        <w:rPr>
-          <w:rFonts w:ascii="Times New Roman" w:eastAsia="Times New Roman" w:hAnsi="Times New Roman" w:cs="Times New Roman"/>
-          <w:b/>
-          <w:bCs/>
-          <w:sz w:val="24"/>
-          <w:szCs w:val="24"/>
-          <w:lang w:eastAsia="es-ES"/>
-        </w:rPr>
-        <w:t>9. Abr</w:t>
-      </w:r>
-      <w:r>
-        <w:rPr>
-          <w:rFonts w:ascii="Times New Roman" w:eastAsia="Times New Roman" w:hAnsi="Times New Roman" w:cs="Times New Roman"/>
-          <w:b/>
-          <w:bCs/>
-          <w:sz w:val="24"/>
-          <w:szCs w:val="24"/>
-          <w:lang w:eastAsia="es-ES"/>
-        </w:rPr>
-        <w:t>a</w:t>
-      </w:r>
-      <w:r>
-        <w:rPr>
-          <w:rFonts w:ascii="Times New Roman" w:eastAsia="Times New Roman" w:hAnsi="Times New Roman" w:cs="Times New Roman"/>
-          <w:b/>
-          <w:bCs/>
-          <w:sz w:val="24"/>
-          <w:szCs w:val="24"/>
-          <w:lang w:eastAsia="es-ES"/>
-        </w:rPr>
-        <w:t xml:space="preserve"> Visual Studio </w:t>
-      </w:r>
-      <w:proofErr w:type="spellStart"/>
-      <w:r>
-        <w:rPr>
-          <w:rFonts w:ascii="Times New Roman" w:eastAsia="Times New Roman" w:hAnsi="Times New Roman" w:cs="Times New Roman"/>
-          <w:b/>
-          <w:bCs/>
-          <w:sz w:val="24"/>
-          <w:szCs w:val="24"/>
-          <w:lang w:eastAsia="es-ES"/>
-        </w:rPr>
-        <w:t>Code</w:t>
-      </w:r>
-      <w:proofErr w:type="spellEnd"/>
-      <w:r>
-        <w:rPr>
-          <w:rFonts w:ascii="Times New Roman" w:eastAsia="Times New Roman" w:hAnsi="Times New Roman" w:cs="Times New Roman"/>
-          <w:b/>
-          <w:bCs/>
-          <w:sz w:val="24"/>
-          <w:szCs w:val="24"/>
-          <w:lang w:eastAsia="es-ES"/>
-        </w:rPr>
-        <w:t xml:space="preserve"> en la carpeta clonada del proyecto.</w:t>
-      </w:r>
-    </w:p>
-    <w:p>
-      <w:pPr>
-        <w:spacing w:before="100" w:beforeAutospacing="1" w:after="100" w:afterAutospacing="1" w:line="240" w:lineRule="auto"/>
-        <w:outlineLvl w:val="3"/>
-        <w:rPr>
-          <w:rFonts w:ascii="Times New Roman" w:eastAsia="Times New Roman" w:hAnsi="Times New Roman" w:cs="Times New Roman"/>
-          <w:b/>
-          <w:bCs/>
-          <w:sz w:val="24"/>
-          <w:szCs w:val="24"/>
-          <w:lang w:eastAsia="es-ES"/>
-        </w:rPr>
-      </w:pPr>
-      <w:r>
-        <w:rPr>
-          <w:rFonts w:ascii="Times New Roman" w:eastAsia="Times New Roman" w:hAnsi="Times New Roman" w:cs="Times New Roman"/>
-          <w:b/>
-          <w:bCs/>
-          <w:sz w:val="24"/>
-          <w:szCs w:val="24"/>
-          <w:lang w:eastAsia="es-ES"/>
-        </w:rPr>
-        <w:t xml:space="preserve">10. </w:t>
-      </w:r>
-      <w:r>
-        <w:rPr>
-          <w:rFonts w:ascii="Times New Roman" w:eastAsia="Times New Roman" w:hAnsi="Times New Roman" w:cs="Times New Roman"/>
-          <w:b/>
-          <w:bCs/>
-          <w:sz w:val="24"/>
-          <w:szCs w:val="24"/>
-          <w:lang w:eastAsia="es-ES"/>
-        </w:rPr>
-        <w:t>Cierre la terminal</w:t>
-      </w:r>
-      <w:r>
-        <w:rPr>
-          <w:rFonts w:ascii="Times New Roman" w:eastAsia="Times New Roman" w:hAnsi="Times New Roman" w:cs="Times New Roman"/>
-          <w:b/>
-          <w:bCs/>
-          <w:sz w:val="24"/>
-          <w:szCs w:val="24"/>
-          <w:lang w:eastAsia="es-ES"/>
-        </w:rPr>
-        <w:t xml:space="preserve"> </w:t>
-      </w:r>
-      <w:r>
-        <w:rPr>
-          <w:rFonts w:ascii="Times New Roman" w:eastAsia="Times New Roman" w:hAnsi="Times New Roman" w:cs="Times New Roman"/>
-          <w:b/>
-          <w:bCs/>
-          <w:sz w:val="24"/>
-          <w:szCs w:val="24"/>
-          <w:lang w:eastAsia="es-ES"/>
-        </w:rPr>
-        <w:t>y</w:t>
-      </w:r>
-      <w:r>
-        <w:rPr>
-          <w:rFonts w:ascii="Times New Roman" w:eastAsia="Times New Roman" w:hAnsi="Times New Roman" w:cs="Times New Roman"/>
-          <w:b/>
-          <w:bCs/>
-          <w:sz w:val="24"/>
-          <w:szCs w:val="24"/>
-          <w:lang w:eastAsia="es-ES"/>
-        </w:rPr>
-        <w:t xml:space="preserve"> abra</w:t>
-      </w:r>
-      <w:r>
-        <w:rPr>
-          <w:rFonts w:ascii="Times New Roman" w:eastAsia="Times New Roman" w:hAnsi="Times New Roman" w:cs="Times New Roman"/>
-          <w:b/>
-          <w:bCs/>
-          <w:sz w:val="24"/>
-          <w:szCs w:val="24"/>
-          <w:lang w:eastAsia="es-ES"/>
-        </w:rPr>
-        <w:t xml:space="preserve"> otra</w:t>
-      </w:r>
-      <w:r>
-        <w:rPr>
-          <w:rFonts w:ascii="Times New Roman" w:eastAsia="Times New Roman" w:hAnsi="Times New Roman" w:cs="Times New Roman"/>
-          <w:b/>
-          <w:bCs/>
-          <w:sz w:val="24"/>
-          <w:szCs w:val="24"/>
-          <w:lang w:eastAsia="es-ES"/>
-        </w:rPr>
-        <w:t xml:space="preserve"> en VS Cose y v</w:t>
-      </w:r>
-      <w:r>
-        <w:rPr>
-          <w:rFonts w:ascii="Times New Roman" w:eastAsia="Times New Roman" w:hAnsi="Times New Roman" w:cs="Times New Roman"/>
-          <w:b/>
-          <w:bCs/>
-          <w:sz w:val="24"/>
-          <w:szCs w:val="24"/>
-          <w:lang w:eastAsia="es-ES"/>
-        </w:rPr>
-        <w:t>aya</w:t>
-      </w:r>
-      <w:r>
-        <w:rPr>
-          <w:rFonts w:ascii="Times New Roman" w:eastAsia="Times New Roman" w:hAnsi="Times New Roman" w:cs="Times New Roman"/>
-          <w:b/>
-          <w:bCs/>
-          <w:sz w:val="24"/>
-          <w:szCs w:val="24"/>
-          <w:lang w:eastAsia="es-ES"/>
-        </w:rPr>
-        <w:t xml:space="preserve"> a la subcarpeta </w:t>
-      </w:r>
-      <w:proofErr w:type="spellStart"/>
-      <w:r>
-        <w:rPr>
-          <w:rFonts w:ascii="Courier New" w:eastAsia="Times New Roman" w:hAnsi="Courier New" w:cs="Courier New"/>
-          <w:b/>
-          <w:bCs/>
-          <w:sz w:val="20"/>
-          <w:szCs w:val="20"/>
-          <w:lang w:eastAsia="es-ES"/>
-        </w:rPr>
-        <w:t>frontend</w:t>
-      </w:r>
-      <w:proofErr w:type="spellEnd"/>
       <w:r>
         <w:rPr>
           <w:rFonts w:ascii="Times New Roman" w:eastAsia="Times New Roman" w:hAnsi="Times New Roman" w:cs="Times New Roman"/>
@@ -2413,7 +2168,6 @@
         </w:rPr>
         <w:t xml:space="preserve">cd </w:t>
       </w:r>
-      <w:proofErr w:type="spellStart"/>
       <w:r>
         <w:rPr>
           <w:rFonts w:ascii="Courier New" w:hAnsi="Courier New" w:cs="Courier New"/>
@@ -2422,7 +2176,6 @@
         </w:rPr>
         <w:t>frontend</w:t>
       </w:r>
-      <w:proofErr w:type="spellEnd"/>
     </w:p>
     <w:p>
       <w:pPr>
@@ -2506,27 +2259,7 @@
           <w:szCs w:val="20"/>
           <w:lang w:val="en-US" w:eastAsia="es-ES"/>
         </w:rPr>
-        <w:t>Set-</w:t>
-      </w:r>
-      <w:proofErr w:type="spellStart"/>
-      <w:r>
-        <w:rPr>
-          <w:rFonts w:ascii="Courier New" w:eastAsia="Times New Roman" w:hAnsi="Courier New" w:cs="Courier New"/>
-          <w:sz w:val="20"/>
-          <w:szCs w:val="20"/>
-          <w:lang w:val="en-US" w:eastAsia="es-ES"/>
-        </w:rPr>
-        <w:t>ExecutionPolicy</w:t>
-      </w:r>
-      <w:proofErr w:type="spellEnd"/>
-      <w:r>
-        <w:rPr>
-          <w:rFonts w:ascii="Courier New" w:eastAsia="Times New Roman" w:hAnsi="Courier New" w:cs="Courier New"/>
-          <w:sz w:val="20"/>
-          <w:szCs w:val="20"/>
-          <w:lang w:val="en-US" w:eastAsia="es-ES"/>
-        </w:rPr>
-        <w:t xml:space="preserve"> Bypass -Scope Process -Force</w:t>
+        <w:t>Set-ExecutionPolicy Bypass -Scope Process -Force</w:t>
       </w:r>
     </w:p>
     <w:p>
@@ -2637,7 +2370,6 @@
           <w:lang w:eastAsia="es-ES"/>
         </w:rPr>
       </w:pPr>
-      <w:proofErr w:type="spellStart"/>
       <w:r>
         <w:rPr>
           <w:rFonts w:ascii="Courier New" w:eastAsia="Times New Roman" w:hAnsi="Courier New" w:cs="Courier New"/>
@@ -2645,9 +2377,8 @@
           <w:szCs w:val="20"/>
           <w:lang w:eastAsia="es-ES"/>
         </w:rPr>
-        <w:t>npm</w:t>
-      </w:r>
-      <w:proofErr w:type="spellEnd"/>
+        <w:t xml:space="preserve">npm </w:t>
+      </w:r>
       <w:r>
         <w:rPr>
           <w:rFonts w:ascii="Courier New" w:eastAsia="Times New Roman" w:hAnsi="Courier New" w:cs="Courier New"/>
@@ -2655,9 +2386,8 @@
           <w:szCs w:val="20"/>
           <w:lang w:eastAsia="es-ES"/>
         </w:rPr>
-        <w:t xml:space="preserve"> </w:t>
-      </w:r>
-      <w:proofErr w:type="spellStart"/>
+        <w:t>i</w:t>
+      </w:r>
       <w:r>
         <w:rPr>
           <w:rFonts w:ascii="Courier New" w:eastAsia="Times New Roman" w:hAnsi="Courier New" w:cs="Courier New"/>
@@ -2665,18 +2395,8 @@
           <w:szCs w:val="20"/>
           <w:lang w:eastAsia="es-ES"/>
         </w:rPr>
-        <w:t>i</w:t>
-      </w:r>
-      <w:r>
-        <w:rPr>
-          <w:rFonts w:ascii="Courier New" w:eastAsia="Times New Roman" w:hAnsi="Courier New" w:cs="Courier New"/>
-          <w:sz w:val="20"/>
-          <w:szCs w:val="20"/>
-          <w:lang w:eastAsia="es-ES"/>
-        </w:rPr>
         <w:t>nstall</w:t>
       </w:r>
-      <w:proofErr w:type="spellEnd"/>
     </w:p>
     <w:p>
       <w:pPr>
@@ -2775,7 +2495,6 @@
           <w:lang w:eastAsia="es-ES"/>
         </w:rPr>
       </w:pPr>
-      <w:proofErr w:type="spellStart"/>
       <w:r>
         <w:rPr>
           <w:rFonts w:ascii="Courier New" w:eastAsia="Times New Roman" w:hAnsi="Courier New" w:cs="Courier New"/>
@@ -2783,29 +2502,8 @@
           <w:szCs w:val="20"/>
           <w:lang w:eastAsia="es-ES"/>
         </w:rPr>
-        <w:t>npm</w:t>
-      </w:r>
-      <w:proofErr w:type="spellEnd"/>
-      <w:r>
-        <w:rPr>
-          <w:rFonts w:ascii="Courier New" w:eastAsia="Times New Roman" w:hAnsi="Courier New" w:cs="Courier New"/>
-          <w:sz w:val="20"/>
-          <w:szCs w:val="20"/>
-          <w:lang w:eastAsia="es-ES"/>
-        </w:rPr>
-        <w:t xml:space="preserve"> run </w:t>
-      </w:r>
-      <w:proofErr w:type="spellStart"/>
-      <w:r>
-        <w:rPr>
-          <w:rFonts w:ascii="Courier New" w:eastAsia="Times New Roman" w:hAnsi="Courier New" w:cs="Courier New"/>
-          <w:sz w:val="20"/>
-          <w:szCs w:val="20"/>
-          <w:lang w:eastAsia="es-ES"/>
-        </w:rPr>
-        <w:t>dev</w:t>
-      </w:r>
-      <w:proofErr w:type="spellEnd"/>
+        <w:t>npm run dev</w:t>
+      </w:r>
     </w:p>
     <w:p>
       <w:pPr>
@@ -2824,7 +2522,7 @@
           <w:szCs w:val="24"/>
           <w:lang w:eastAsia="es-ES"/>
         </w:rPr>
-        <w:pict>
+        <w:pict w14:anchorId="4C142490">
           <v:rect id="_x0000_i1028" style="width:0;height:1.5pt" o:hralign="center" o:hrstd="t" o:hr="t" fillcolor="#a0a0a0" stroked="f"/>
         </w:pict>
       </w:r>
@@ -3202,25 +2900,7 @@
           <w:sz w:val="24"/>
           <w:lang w:eastAsia="es-ES"/>
         </w:rPr>
-        <w:t xml:space="preserve">De forma automática, el </w:t>
-      </w:r>
-      <w:proofErr w:type="spellStart"/>
-      <w:r>
-        <w:rPr>
-          <w:rFonts w:ascii="Times New Roman" w:hAnsi="Times New Roman" w:cs="Times New Roman"/>
-          <w:sz w:val="24"/>
-          <w:lang w:eastAsia="es-ES"/>
-        </w:rPr>
-        <w:t>backend</w:t>
-      </w:r>
-      <w:proofErr w:type="spellEnd"/>
-      <w:r>
-        <w:rPr>
-          <w:rFonts w:ascii="Times New Roman" w:hAnsi="Times New Roman" w:cs="Times New Roman"/>
-          <w:sz w:val="24"/>
-          <w:lang w:eastAsia="es-ES"/>
-        </w:rPr>
-        <w:t xml:space="preserve"> genera el usuario administrador con las siguientes credenciales: </w:t>
+        <w:t xml:space="preserve">De forma automática, el backend genera el usuario administrador con las siguientes credenciales: </w:t>
       </w:r>
       <w:r>
         <w:rPr>
@@ -3288,7 +2968,7 @@
           <w:lang w:eastAsia="es-ES"/>
         </w:rPr>
         <w:drawing>
-          <wp:anchor distT="0" distB="0" distL="114300" distR="114300" simplePos="0" relativeHeight="251661312" behindDoc="0" locked="0" layoutInCell="1" allowOverlap="1" wp14:anchorId="42F68F9E" wp14:editId="07F0899A">
+          <wp:anchor distT="0" distB="0" distL="114300" distR="114300" simplePos="0" relativeHeight="251661312" behindDoc="0" locked="0" layoutInCell="1" allowOverlap="1" wp14:anchorId="3BCB92F0" wp14:editId="0BD0C6E0">
             <wp:simplePos x="0" y="0"/>
             <wp:positionH relativeFrom="margin">
               <wp:align>center</wp:align>
@@ -3519,7 +3199,7 @@
           <w:szCs w:val="24"/>
           <w:lang w:eastAsia="es-ES"/>
         </w:rPr>
-        <w:pict>
+        <w:pict w14:anchorId="636A3000">
           <v:rect id="_x0000_i1029" style="width:0;height:1.5pt" o:hralign="center" o:hrstd="t" o:hr="t" fillcolor="#a0a0a0" stroked="f"/>
         </w:pict>
       </w:r>
@@ -3546,21 +3226,8 @@
           <w:szCs w:val="27"/>
           <w:lang w:eastAsia="es-ES"/>
         </w:rPr>
-        <w:t xml:space="preserve">Para realizar las pruebas unitarias con </w:t>
-      </w:r>
-      <w:proofErr w:type="spellStart"/>
-      <w:r>
-        <w:rPr>
-          <w:rFonts w:ascii="Times New Roman" w:eastAsia="Times New Roman" w:hAnsi="Times New Roman" w:cs="Times New Roman"/>
-          <w:b/>
-          <w:bCs/>
-          <w:sz w:val="32"/>
-          <w:szCs w:val="27"/>
-          <w:lang w:eastAsia="es-ES"/>
-        </w:rPr>
-        <w:t>PHPUnit</w:t>
-      </w:r>
-      <w:proofErr w:type="spellEnd"/>
+        <w:t>Para realizar las pruebas unitarias con PHPUnit</w:t>
+      </w:r>
     </w:p>
     <w:p>
       <w:pPr>
@@ -3582,25 +3249,7 @@
           <w:sz w:val="24"/>
           <w:lang w:eastAsia="es-ES"/>
         </w:rPr>
-        <w:t xml:space="preserve">Descargar </w:t>
-      </w:r>
-      <w:proofErr w:type="spellStart"/>
-      <w:r>
-        <w:rPr>
-          <w:rFonts w:ascii="Times New Roman" w:hAnsi="Times New Roman" w:cs="Times New Roman"/>
-          <w:sz w:val="24"/>
-          <w:lang w:eastAsia="es-ES"/>
-        </w:rPr>
-        <w:t>PHPUnit</w:t>
-      </w:r>
-      <w:proofErr w:type="spellEnd"/>
-      <w:r>
-        <w:rPr>
-          <w:rFonts w:ascii="Times New Roman" w:hAnsi="Times New Roman" w:cs="Times New Roman"/>
-          <w:sz w:val="24"/>
-          <w:lang w:eastAsia="es-ES"/>
-        </w:rPr>
-        <w:t xml:space="preserve"> 11.5.19.</w:t>
+        <w:t>Descargar PHPUnit 11.5.19.</w:t>
       </w:r>
     </w:p>
     <w:p>
@@ -3623,25 +3272,7 @@
           <w:sz w:val="24"/>
           <w:lang w:eastAsia="es-ES"/>
         </w:rPr>
-        <w:t xml:space="preserve">Crear una carpeta </w:t>
-      </w:r>
-      <w:proofErr w:type="spellStart"/>
-      <w:r>
-        <w:rPr>
-          <w:rFonts w:ascii="Times New Roman" w:hAnsi="Times New Roman" w:cs="Times New Roman"/>
-          <w:sz w:val="24"/>
-          <w:lang w:eastAsia="es-ES"/>
-        </w:rPr>
-        <w:t>phpunit</w:t>
-      </w:r>
-      <w:proofErr w:type="spellEnd"/>
-      <w:r>
-        <w:rPr>
-          <w:rFonts w:ascii="Times New Roman" w:hAnsi="Times New Roman" w:cs="Times New Roman"/>
-          <w:sz w:val="24"/>
-          <w:lang w:eastAsia="es-ES"/>
-        </w:rPr>
-        <w:t xml:space="preserve"> en la ruta C:\</w:t>
+        <w:t>Crear una carpeta phpunit en la ruta C:\</w:t>
       </w:r>
     </w:p>
     <w:p>
@@ -3664,25 +3295,7 @@
           <w:sz w:val="24"/>
           <w:lang w:eastAsia="es-ES"/>
         </w:rPr>
-        <w:t xml:space="preserve">En la carpeta </w:t>
-      </w:r>
-      <w:proofErr w:type="spellStart"/>
-      <w:r>
-        <w:rPr>
-          <w:rFonts w:ascii="Times New Roman" w:hAnsi="Times New Roman" w:cs="Times New Roman"/>
-          <w:sz w:val="24"/>
-          <w:lang w:eastAsia="es-ES"/>
-        </w:rPr>
-        <w:t>phpunit</w:t>
-      </w:r>
-      <w:proofErr w:type="spellEnd"/>
-      <w:r>
-        <w:rPr>
-          <w:rFonts w:ascii="Times New Roman" w:hAnsi="Times New Roman" w:cs="Times New Roman"/>
-          <w:sz w:val="24"/>
-          <w:lang w:eastAsia="es-ES"/>
-        </w:rPr>
-        <w:t>:</w:t>
+        <w:t>En la carpeta phpunit:</w:t>
       </w:r>
     </w:p>
     <w:p>
@@ -3793,25 +3406,7 @@
           <w:sz w:val="20"/>
           <w:lang w:val="en-US" w:eastAsia="es-ES"/>
         </w:rPr>
-        <w:t xml:space="preserve">@echo </w:t>
-      </w:r>
-      <w:proofErr w:type="spellStart"/>
-      <w:r>
-        <w:rPr>
-          <w:rFonts w:ascii="Courier New" w:hAnsi="Courier New" w:cs="Courier New"/>
-          <w:sz w:val="20"/>
-          <w:lang w:val="en-US" w:eastAsia="es-ES"/>
-        </w:rPr>
-        <w:t>offphp</w:t>
-      </w:r>
-      <w:proofErr w:type="spellEnd"/>
-      <w:r>
-        <w:rPr>
-          <w:rFonts w:ascii="Courier New" w:hAnsi="Courier New" w:cs="Courier New"/>
-          <w:sz w:val="20"/>
-          <w:lang w:val="en-US" w:eastAsia="es-ES"/>
-        </w:rPr>
-        <w:t xml:space="preserve"> "C:\phpunit\phpunit-11.5.19.phar" %*</w:t>
+        <w:t>@echo offphp "C:\phpunit\phpunit-11.5.19.phar" %*</w:t>
       </w:r>
     </w:p>
     <w:p>
@@ -3835,9 +3430,8 @@
           <w:szCs w:val="24"/>
           <w:lang w:eastAsia="es-ES"/>
         </w:rPr>
-        <w:t xml:space="preserve">Agregar </w:t>
-      </w:r>
-      <w:proofErr w:type="spellStart"/>
+        <w:t xml:space="preserve">Agregar PHPUnit </w:t>
+      </w:r>
       <w:r>
         <w:rPr>
           <w:rFonts w:ascii="Times New Roman" w:hAnsi="Times New Roman" w:cs="Times New Roman"/>
@@ -3845,9 +3439,8 @@
           <w:szCs w:val="24"/>
           <w:lang w:eastAsia="es-ES"/>
         </w:rPr>
-        <w:t>PHPUnit</w:t>
-      </w:r>
-      <w:proofErr w:type="spellEnd"/>
+        <w:t xml:space="preserve">y </w:t>
+      </w:r>
       <w:r>
         <w:rPr>
           <w:rFonts w:ascii="Times New Roman" w:hAnsi="Times New Roman" w:cs="Times New Roman"/>
@@ -3855,28 +3448,8 @@
           <w:szCs w:val="24"/>
           <w:lang w:eastAsia="es-ES"/>
         </w:rPr>
-        <w:t xml:space="preserve"> </w:t>
-      </w:r>
-      <w:r>
-        <w:rPr>
-          <w:rFonts w:ascii="Times New Roman" w:hAnsi="Times New Roman" w:cs="Times New Roman"/>
-          <w:sz w:val="24"/>
-          <w:szCs w:val="24"/>
-          <w:lang w:eastAsia="es-ES"/>
-        </w:rPr>
-        <w:t xml:space="preserve">y </w:t>
-      </w:r>
-      <w:r>
-        <w:rPr>
-          <w:rFonts w:ascii="Times New Roman" w:hAnsi="Times New Roman" w:cs="Times New Roman"/>
-          <w:sz w:val="24"/>
-          <w:szCs w:val="24"/>
-          <w:lang w:eastAsia="es-ES"/>
-        </w:rPr>
         <w:t xml:space="preserve">PHP (de XAMPP) </w:t>
       </w:r>
-      <w:bookmarkStart w:id="0" w:name="_GoBack"/>
-      <w:bookmarkEnd w:id="0"/>
       <w:r>
         <w:rPr>
           <w:rFonts w:ascii="Times New Roman" w:hAnsi="Times New Roman" w:cs="Times New Roman"/>
@@ -3903,7 +3476,7 @@
         </w:rPr>
         <w:lastRenderedPageBreak/>
         <w:drawing>
-          <wp:anchor distT="0" distB="0" distL="114300" distR="114300" simplePos="0" relativeHeight="251660288" behindDoc="1" locked="0" layoutInCell="1" allowOverlap="1" wp14:anchorId="63DD6B3F" wp14:editId="4068429A">
+          <wp:anchor distT="0" distB="0" distL="114300" distR="114300" simplePos="0" relativeHeight="251660288" behindDoc="1" locked="0" layoutInCell="1" allowOverlap="1" wp14:anchorId="7BC06BC7" wp14:editId="1FF3B432">
             <wp:simplePos x="0" y="0"/>
             <wp:positionH relativeFrom="margin">
               <wp:align>center</wp:align>
@@ -4056,7 +3629,7 @@
         <mc:AlternateContent>
           <mc:Choice Requires="wps">
             <w:drawing>
-              <wp:anchor distT="0" distB="0" distL="114300" distR="114300" simplePos="0" relativeHeight="251659264" behindDoc="0" locked="0" layoutInCell="1" allowOverlap="1" wp14:anchorId="73720FF0" wp14:editId="79DA661E">
+              <wp:anchor distT="0" distB="0" distL="114300" distR="114300" simplePos="0" relativeHeight="251659264" behindDoc="0" locked="0" layoutInCell="1" allowOverlap="1" wp14:anchorId="6354A23A" wp14:editId="40E07086">
                 <wp:simplePos x="0" y="0"/>
                 <wp:positionH relativeFrom="column">
                   <wp:posOffset>1246884</wp:posOffset>
@@ -4257,25 +3830,7 @@
           <w:sz w:val="24"/>
           <w:lang w:eastAsia="es-ES"/>
         </w:rPr>
-        <w:t xml:space="preserve">Con el proyecto abierto en Visual Studio </w:t>
-      </w:r>
-      <w:proofErr w:type="spellStart"/>
-      <w:r>
-        <w:rPr>
-          <w:rFonts w:ascii="Times New Roman" w:hAnsi="Times New Roman" w:cs="Times New Roman"/>
-          <w:sz w:val="24"/>
-          <w:lang w:eastAsia="es-ES"/>
-        </w:rPr>
-        <w:t>Code</w:t>
-      </w:r>
-      <w:proofErr w:type="spellEnd"/>
-      <w:r>
-        <w:rPr>
-          <w:rFonts w:ascii="Times New Roman" w:hAnsi="Times New Roman" w:cs="Times New Roman"/>
-          <w:sz w:val="24"/>
-          <w:lang w:eastAsia="es-ES"/>
-        </w:rPr>
-        <w:t>, ir a la ruta:</w:t>
+        <w:t>Con el proyecto abierto en Visual Studio Code, ir a la ruta:</w:t>
       </w:r>
     </w:p>
     <w:p>
@@ -4329,7 +3884,6 @@
           <w:lang w:val="en-US" w:eastAsia="es-ES"/>
         </w:rPr>
       </w:pPr>
-      <w:proofErr w:type="spellStart"/>
       <w:r>
         <w:rPr>
           <w:rFonts w:ascii="Times New Roman" w:eastAsia="Times New Roman" w:hAnsi="Times New Roman" w:cs="Times New Roman"/>
@@ -4337,39 +3891,8 @@
           <w:szCs w:val="20"/>
           <w:lang w:val="en-US" w:eastAsia="es-ES"/>
         </w:rPr>
-        <w:t>Ejecutar</w:t>
-      </w:r>
-      <w:proofErr w:type="spellEnd"/>
-      <w:r>
-        <w:rPr>
-          <w:rFonts w:ascii="Times New Roman" w:eastAsia="Times New Roman" w:hAnsi="Times New Roman" w:cs="Times New Roman"/>
-          <w:sz w:val="24"/>
-          <w:szCs w:val="20"/>
-          <w:lang w:val="en-US" w:eastAsia="es-ES"/>
-        </w:rPr>
-        <w:t xml:space="preserve"> el </w:t>
-      </w:r>
-      <w:proofErr w:type="spellStart"/>
-      <w:r>
-        <w:rPr>
-          <w:rFonts w:ascii="Times New Roman" w:eastAsia="Times New Roman" w:hAnsi="Times New Roman" w:cs="Times New Roman"/>
-          <w:sz w:val="24"/>
-          <w:szCs w:val="20"/>
-          <w:lang w:val="en-US" w:eastAsia="es-ES"/>
-        </w:rPr>
-        <w:t>comando</w:t>
-      </w:r>
-      <w:proofErr w:type="spellEnd"/>
-      <w:r>
-        <w:rPr>
-          <w:rFonts w:ascii="Times New Roman" w:eastAsia="Times New Roman" w:hAnsi="Times New Roman" w:cs="Times New Roman"/>
-          <w:sz w:val="24"/>
-          <w:szCs w:val="20"/>
-          <w:lang w:val="en-US" w:eastAsia="es-ES"/>
-        </w:rPr>
-        <w:t xml:space="preserve">: </w:t>
-      </w:r>
-      <w:proofErr w:type="spellStart"/>
+        <w:t xml:space="preserve">Ejecutar el comando: </w:t>
+      </w:r>
       <w:r>
         <w:rPr>
           <w:rFonts w:ascii="Courier New" w:eastAsia="Times New Roman" w:hAnsi="Courier New" w:cs="Courier New"/>
@@ -4379,7 +3902,6 @@
         </w:rPr>
         <w:t>phpunit</w:t>
       </w:r>
-      <w:proofErr w:type="spellEnd"/>
     </w:p>
     <w:p>
       <w:pPr>
@@ -4390,6 +3912,15 @@
           <w:lang w:eastAsia="es-ES"/>
         </w:rPr>
       </w:pPr>
+      <w:r>
+        <w:rPr>
+          <w:rFonts w:ascii="Courier New" w:eastAsia="Times New Roman" w:hAnsi="Courier New" w:cs="Courier New"/>
+          <w:sz w:val="20"/>
+          <w:szCs w:val="20"/>
+          <w:lang w:eastAsia="es-ES"/>
+        </w:rPr>
+        <w:t>php D:\phpunit\phpunit-11.5.55.phar -c tests/phpunit.xml</w:t>
+      </w:r>
     </w:p>
     <w:sectPr>
       <w:pgSz w:w="11906" w:h="16838"/>
@@ -4402,7 +3933,7 @@
 </file>
 
 <file path=word/numbering.xml><?xml version="1.0" encoding="utf-8"?>
-<w:numbering xmlns:wpc="http://schemas.microsoft.com/office/word/2010/wordprocessingCanvas" xmlns:cx="http://schemas.microsoft.com/office/drawing/2014/chartex" xmlns:mc="http://schemas.openxmlformats.org/markup-compatibility/2006" xmlns:o="urn:schemas-microsoft-com:office:office" xmlns:r="http://schemas.openxmlformats.org/officeDocument/2006/relationships" xmlns:m="http://schemas.openxmlformats.org/officeDocument/2006/math" xmlns:v="urn:schemas-microsoft-com:vml" xmlns:wp14="http://schemas.microsoft.com/office/word/2010/wordprocessingDrawing" xmlns:wp="http://schemas.openxmlformats.org/drawingml/2006/wordprocessingDrawing" xmlns:w10="urn:schemas-microsoft-com:office:word" xmlns:w="http://schemas.openxmlformats.org/wordprocessingml/2006/main" xmlns:w14="http://schemas.microsoft.com/office/word/2010/wordml" xmlns:w15="http://schemas.microsoft.com/office/word/2012/wordml" xmlns:w16se="http://schemas.microsoft.com/office/word/2015/wordml/symex" xmlns:wpg="http://schemas.microsoft.com/office/word/2010/wordprocessingGroup" xmlns:wpi="http://schemas.microsoft.com/office/word/2010/wordprocessingInk" xmlns:wne="http://schemas.microsoft.com/office/word/2006/wordml" xmlns:wps="http://schemas.microsoft.com/office/word/2010/wordprocessingShape" mc:Ignorable="w14 w15 w16se wp14">
+<w:numbering xmlns:wpc="http://schemas.microsoft.com/office/word/2010/wordprocessingCanvas" xmlns:cx="http://schemas.microsoft.com/office/drawing/2014/chartex" xmlns:cx1="http://schemas.microsoft.com/office/drawing/2015/9/8/chartex" xmlns:cx2="http://schemas.microsoft.com/office/drawing/2015/10/21/chartex" xmlns:cx3="http://schemas.microsoft.com/office/drawing/2016/5/9/chartex" xmlns:cx4="http://schemas.microsoft.com/office/drawing/2016/5/10/chartex" xmlns:cx5="http://schemas.microsoft.com/office/drawing/2016/5/11/chartex" xmlns:cx6="http://schemas.microsoft.com/office/drawing/2016/5/12/chartex" xmlns:cx7="http://schemas.microsoft.com/office/drawing/2016/5/13/chartex" xmlns:cx8="http://schemas.microsoft.com/office/drawing/2016/5/14/chartex" xmlns:mc="http://schemas.openxmlformats.org/markup-compatibility/2006" xmlns:aink="http://schemas.microsoft.com/office/drawing/2016/ink" xmlns:am3d="http://schemas.microsoft.com/office/drawing/2017/model3d" xmlns:o="urn:schemas-microsoft-com:office:office" xmlns:r="http://schemas.openxmlformats.org/officeDocument/2006/relationships" xmlns:m="http://schemas.openxmlformats.org/officeDocument/2006/math" xmlns:v="urn:schemas-microsoft-com:vml" xmlns:wp14="http://schemas.microsoft.com/office/word/2010/wordprocessingDrawing" xmlns:wp="http://schemas.openxmlformats.org/drawingml/2006/wordprocessingDrawing" xmlns:w10="urn:schemas-microsoft-com:office:word" xmlns:w="http://schemas.openxmlformats.org/wordprocessingml/2006/main" xmlns:w14="http://schemas.microsoft.com/office/word/2010/wordml" xmlns:w15="http://schemas.microsoft.com/office/word/2012/wordml" xmlns:w16cex="http://schemas.microsoft.com/office/word/2018/wordml/cex" xmlns:w16cid="http://schemas.microsoft.com/office/word/2016/wordml/cid" xmlns:w16="http://schemas.microsoft.com/office/word/2018/wordml" xmlns:w16sdtdh="http://schemas.microsoft.com/office/word/2020/wordml/sdtdatahash" xmlns:w16se="http://schemas.microsoft.com/office/word/2015/wordml/symex" xmlns:wpg="http://schemas.microsoft.com/office/word/2010/wordprocessingGroup" xmlns:wpi="http://schemas.microsoft.com/office/word/2010/wordprocessingInk" xmlns:wne="http://schemas.microsoft.com/office/word/2006/wordml" xmlns:wps="http://schemas.microsoft.com/office/word/2010/wordprocessingShape" mc:Ignorable="w14 w15 w16se w16cid w16 w16cex w16sdtdh wp14">
   <w:abstractNum w:abstractNumId="0" w15:restartNumberingAfterBreak="0">
     <w:nsid w:val="004B60D4"/>
     <w:multiLevelType w:val="multilevel"/>
@@ -7416,7 +6947,7 @@
 </file>
 
 <file path=word/styles.xml><?xml version="1.0" encoding="utf-8"?>
-<w:styles xmlns:mc="http://schemas.openxmlformats.org/markup-compatibility/2006" xmlns:r="http://schemas.openxmlformats.org/officeDocument/2006/relationships" xmlns:w="http://schemas.openxmlformats.org/wordprocessingml/2006/main" xmlns:w14="http://schemas.microsoft.com/office/word/2010/wordml" xmlns:w15="http://schemas.microsoft.com/office/word/2012/wordml" xmlns:w16se="http://schemas.microsoft.com/office/word/2015/wordml/symex" mc:Ignorable="w14 w15 w16se">
+<w:styles xmlns:mc="http://schemas.openxmlformats.org/markup-compatibility/2006" xmlns:r="http://schemas.openxmlformats.org/officeDocument/2006/relationships" xmlns:w="http://schemas.openxmlformats.org/wordprocessingml/2006/main" xmlns:w14="http://schemas.microsoft.com/office/word/2010/wordml" xmlns:w15="http://schemas.microsoft.com/office/word/2012/wordml" xmlns:w16cex="http://schemas.microsoft.com/office/word/2018/wordml/cex" xmlns:w16cid="http://schemas.microsoft.com/office/word/2016/wordml/cid" xmlns:w16="http://schemas.microsoft.com/office/word/2018/wordml" xmlns:w16sdtdh="http://schemas.microsoft.com/office/word/2020/wordml/sdtdatahash" xmlns:w16se="http://schemas.microsoft.com/office/word/2015/wordml/symex" mc:Ignorable="w14 w15 w16se w16cid w16 w16cex w16sdtdh">
   <w:docDefaults>
     <w:rPrDefault>
       <w:rPr>
@@ -7432,7 +6963,7 @@
       </w:pPr>
     </w:pPrDefault>
   </w:docDefaults>
-  <w:latentStyles w:defLockedState="0" w:defUIPriority="99" w:defSemiHidden="0" w:defUnhideWhenUsed="0" w:defQFormat="0" w:count="371">
+  <w:latentStyles w:defLockedState="0" w:defUIPriority="99" w:defSemiHidden="0" w:defUnhideWhenUsed="0" w:defQFormat="0" w:count="376">
     <w:lsdException w:name="Normal" w:uiPriority="0" w:qFormat="1"/>
     <w:lsdException w:name="heading 1" w:uiPriority="9" w:qFormat="1"/>
     <w:lsdException w:name="heading 2" w:semiHidden="1" w:uiPriority="9" w:unhideWhenUsed="1" w:qFormat="1"/>
@@ -7538,7 +7069,6 @@
     <w:lsdException w:name="HTML Sample" w:semiHidden="1" w:unhideWhenUsed="1"/>
     <w:lsdException w:name="HTML Typewriter" w:semiHidden="1" w:unhideWhenUsed="1"/>
     <w:lsdException w:name="HTML Variable" w:semiHidden="1" w:unhideWhenUsed="1"/>
-    <w:lsdException w:name="Normal Table" w:semiHidden="1" w:unhideWhenUsed="1"/>
     <w:lsdException w:name="annotation subject" w:semiHidden="1" w:unhideWhenUsed="1"/>
     <w:lsdException w:name="No List" w:semiHidden="1" w:unhideWhenUsed="1"/>
     <w:lsdException w:name="Outline List 1" w:semiHidden="1" w:unhideWhenUsed="1"/>
@@ -7581,11 +7111,8 @@
     <w:lsdException w:name="Table Contemporary" w:semiHidden="1" w:unhideWhenUsed="1"/>
     <w:lsdException w:name="Table Elegant" w:semiHidden="1" w:unhideWhenUsed="1"/>
     <w:lsdException w:name="Table Professional" w:semiHidden="1" w:unhideWhenUsed="1"/>
-    <w:lsdException w:name="Table Subtle 1" w:semiHidden="1" w:unhideWhenUsed="1"/>
     <w:lsdException w:name="Table Subtle 2" w:semiHidden="1" w:unhideWhenUsed="1"/>
     <w:lsdException w:name="Table Web 1" w:semiHidden="1" w:unhideWhenUsed="1"/>
-    <w:lsdException w:name="Table Web 2" w:semiHidden="1" w:unhideWhenUsed="1"/>
-    <w:lsdException w:name="Table Web 3" w:semiHidden="1" w:unhideWhenUsed="1"/>
     <w:lsdException w:name="Balloon Text" w:semiHidden="1" w:unhideWhenUsed="1"/>
     <w:lsdException w:name="Table Grid" w:uiPriority="39"/>
     <w:lsdException w:name="Table Theme" w:semiHidden="1" w:unhideWhenUsed="1"/>
@@ -7804,6 +7331,11 @@
     <w:lsdException w:name="List Table 5 Dark Accent 6" w:uiPriority="50"/>
     <w:lsdException w:name="List Table 6 Colorful Accent 6" w:uiPriority="51"/>
     <w:lsdException w:name="List Table 7 Colorful Accent 6" w:uiPriority="52"/>
+    <w:lsdException w:name="Mention" w:semiHidden="1" w:unhideWhenUsed="1"/>
+    <w:lsdException w:name="Smart Hyperlink" w:semiHidden="1" w:unhideWhenUsed="1"/>
+    <w:lsdException w:name="Hashtag" w:semiHidden="1" w:unhideWhenUsed="1"/>
+    <w:lsdException w:name="Unresolved Mention" w:semiHidden="1" w:unhideWhenUsed="1"/>
+    <w:lsdException w:name="Smart Link" w:semiHidden="1" w:unhideWhenUsed="1"/>
   </w:latentStyles>
   <w:style w:type="paragraph" w:default="1" w:styleId="Normal">
     <w:name w:val="Normal"/>

</xml_diff>